<commit_message>
Cover letter template: replace em-dashes with plain sentence structure
Co-Authored-By: Claude Fable 5 <noreply@anthropic.com>
</commit_message>
<xml_diff>
--- a/assets/Charalampos-Photiou-Cover-Letter.docx
+++ b/assets/Charalampos-Photiou-Cover-Letter.docx
@@ -47,7 +47,7 @@
         </w:rPr>
         <w:t xml:space="preserve">Limassol, Cyprus  •  +357 96 425378  •  </w:t>
       </w:r>
-      <w:hyperlink w:history="1" r:id="rIdtxryb598x7qdncylcevez">
+      <w:hyperlink w:history="1" r:id="rIdvylbuagehrpef03ka-vtu">
         <w:r>
           <w:rPr>
             <w:color w:val="5B6573"/>
@@ -65,7 +65,7 @@
         </w:rPr>
         <w:t xml:space="preserve">  •  </w:t>
       </w:r>
-      <w:hyperlink w:history="1" r:id="rIdyw8er0-wpq31cnmankpx9">
+      <w:hyperlink w:history="1" r:id="rIdvt6b7z1pbfimuh90lmlxw">
         <w:r>
           <w:rPr>
             <w:color w:val="5B6573"/>
@@ -256,7 +256,7 @@
           <w:sz w:val="21"/>
           <w:szCs w:val="21"/>
         </w:rPr>
-        <w:t xml:space="preserve">. I am a web developer and digital marketing executive at Fameline Holding Group, where since 2023 I have run the full stack of digital for a group of maritime and trading brands — from hand-coding production websites to running the campaigns that drive traffic to them.</w:t>
+        <w:t xml:space="preserve">. I am a web developer and digital marketing executive at Fameline Holding Group, where since 2023 I have run the full stack of digital for a group of maritime and trading brands, from hand-coding production websites to running the campaigns that drive traffic to them.</w:t>
       </w:r>
     </w:p>
     <w:p>
@@ -292,7 +292,7 @@
           <w:sz w:val="21"/>
           <w:szCs w:val="21"/>
         </w:rPr>
-        <w:t xml:space="preserve"> I believe the combination of hands-on development and full-funnel marketing is exactly what lets one person own a website end to end — build it, rank it, and grow its audience.</w:t>
+        <w:t xml:space="preserve"> I believe the combination of hands-on development and full-funnel marketing is exactly what lets one person own a website end to end: build it, rank it, and grow its audience.</w:t>
       </w:r>
     </w:p>
     <w:p>

</xml_diff>